<commit_message>
wrong language for a job title
oprichter -> founder
</commit_message>
<xml_diff>
--- a/Resume-Bas.docx
+++ b/Resume-Bas.docx
@@ -840,27 +840,7 @@
           <w:sz w:val="20"/>
           <w:szCs w:val="20"/>
         </w:rPr>
-        <w:t xml:space="preserve">I took charge of the architecture of a project that had little progress over the five years before I joined. </w:t>
-      </w:r>
-      <w:proofErr w:type="gramStart"/>
-      <w:r>
-        <w:rPr>
-          <w:rFonts w:ascii="Arial" w:eastAsia="Arial" w:hAnsi="Arial" w:cs="Arial"/>
-          <w:color w:val="000000"/>
-          <w:sz w:val="20"/>
-          <w:szCs w:val="20"/>
-        </w:rPr>
-        <w:t>Took</w:t>
-      </w:r>
-      <w:proofErr w:type="gramEnd"/>
-      <w:r>
-        <w:rPr>
-          <w:rFonts w:ascii="Arial" w:eastAsia="Arial" w:hAnsi="Arial" w:cs="Arial"/>
-          <w:color w:val="000000"/>
-          <w:sz w:val="20"/>
-          <w:szCs w:val="20"/>
-        </w:rPr>
-        <w:t xml:space="preserve"> the initiative to </w:t>
+        <w:t xml:space="preserve">I took charge of the architecture of a project that had little progress over the five years before I joined. Took the initiative to </w:t>
       </w:r>
       <w:r>
         <w:rPr>
@@ -961,27 +941,7 @@
           <w:sz w:val="20"/>
           <w:szCs w:val="20"/>
         </w:rPr>
-        <w:t xml:space="preserve"> I focused on maturing the organization. The team's central objective was building a maintainable system with a keen emphasis on the traceability of data and activities. This focus reduced the overall cost of ownership for the business. Acting as a liaison between business units and technology and </w:t>
-      </w:r>
-      <w:proofErr w:type="gramStart"/>
-      <w:r>
-        <w:rPr>
-          <w:rFonts w:ascii="Arial" w:eastAsia="Arial" w:hAnsi="Arial" w:cs="Arial"/>
-          <w:color w:val="000000"/>
-          <w:sz w:val="20"/>
-          <w:szCs w:val="20"/>
-        </w:rPr>
-        <w:t>bridging</w:t>
-      </w:r>
-      <w:proofErr w:type="gramEnd"/>
-      <w:r>
-        <w:rPr>
-          <w:rFonts w:ascii="Arial" w:eastAsia="Arial" w:hAnsi="Arial" w:cs="Arial"/>
-          <w:color w:val="000000"/>
-          <w:sz w:val="20"/>
-          <w:szCs w:val="20"/>
-        </w:rPr>
-        <w:t xml:space="preserve"> the gap between onshore and offshore teams, I facilitated mutual understanding and guided </w:t>
+        <w:t xml:space="preserve"> I focused on maturing the organization. The team's central objective was building a maintainable system with a keen emphasis on the traceability of data and activities. This focus reduced the overall cost of ownership for the business. Acting as a liaison between business units and technology and bridging the gap between onshore and offshore teams, I facilitated mutual understanding and guided </w:t>
       </w:r>
       <w:r>
         <w:rPr>
@@ -1112,27 +1072,7 @@
           <w:sz w:val="20"/>
           <w:szCs w:val="20"/>
         </w:rPr>
-        <w:t xml:space="preserve">The technology stack included Java and Kubernetes hosted on AWS, seamlessly integrating into </w:t>
-      </w:r>
-      <w:proofErr w:type="spellStart"/>
-      <w:r>
-        <w:rPr>
-          <w:rFonts w:ascii="Arial" w:eastAsia="Arial" w:hAnsi="Arial" w:cs="Arial"/>
-          <w:color w:val="000000"/>
-          <w:sz w:val="20"/>
-          <w:szCs w:val="20"/>
-        </w:rPr>
-        <w:t>JobDiva</w:t>
-      </w:r>
-      <w:proofErr w:type="spellEnd"/>
-      <w:r>
-        <w:rPr>
-          <w:rFonts w:ascii="Arial" w:eastAsia="Arial" w:hAnsi="Arial" w:cs="Arial"/>
-          <w:color w:val="000000"/>
-          <w:sz w:val="20"/>
-          <w:szCs w:val="20"/>
-        </w:rPr>
-        <w:t>, SAP S/4HANA Cloud, Vertex, ADP, and Okta.</w:t>
+        <w:t>The technology stack included Java and Kubernetes hosted on AWS, seamlessly integrating into JobDiva, SAP S/4HANA Cloud, Vertex, ADP, and Okta.</w:t>
       </w:r>
     </w:p>
     <w:p>
@@ -1384,17 +1324,15 @@
           <w:highlight w:val="white"/>
         </w:rPr>
       </w:pPr>
-      <w:proofErr w:type="spellStart"/>
-      <w:r>
-        <w:rPr>
-          <w:rFonts w:ascii="Arial" w:eastAsia="Arial" w:hAnsi="Arial" w:cs="Arial"/>
-          <w:b/>
-          <w:sz w:val="20"/>
-          <w:szCs w:val="20"/>
-        </w:rPr>
-        <w:t>Oprichter</w:t>
-      </w:r>
-      <w:proofErr w:type="spellEnd"/>
+      <w:r>
+        <w:rPr>
+          <w:rFonts w:ascii="Arial" w:eastAsia="Arial" w:hAnsi="Arial" w:cs="Arial"/>
+          <w:b/>
+          <w:sz w:val="20"/>
+          <w:szCs w:val="20"/>
+        </w:rPr>
+        <w:t>Founder</w:t>
+      </w:r>
       <w:r>
         <w:rPr>
           <w:rFonts w:ascii="Arial" w:eastAsia="Arial" w:hAnsi="Arial" w:cs="Arial"/>
@@ -2232,25 +2170,7 @@
           <w:sz w:val="20"/>
           <w:szCs w:val="20"/>
         </w:rPr>
-        <w:t xml:space="preserve"> to provide technical support and mentor QA </w:t>
-      </w:r>
-      <w:proofErr w:type="gramStart"/>
-      <w:r>
-        <w:rPr>
-          <w:rFonts w:ascii="Arial" w:eastAsia="Arial" w:hAnsi="Arial" w:cs="Arial"/>
-          <w:sz w:val="20"/>
-          <w:szCs w:val="20"/>
-        </w:rPr>
-        <w:t>members</w:t>
-      </w:r>
-      <w:proofErr w:type="gramEnd"/>
-      <w:r>
-        <w:rPr>
-          <w:rFonts w:ascii="Arial" w:eastAsia="Arial" w:hAnsi="Arial" w:cs="Arial"/>
-          <w:sz w:val="20"/>
-          <w:szCs w:val="20"/>
-        </w:rPr>
-        <w:t xml:space="preserve"> post-contract.</w:t>
+        <w:t xml:space="preserve"> to provide technical support and mentor QA members post-contract.</w:t>
       </w:r>
     </w:p>
     <w:p>
@@ -2834,25 +2754,14 @@
         </w:rPr>
         <w:t xml:space="preserve">million concurrent users watching content. </w:t>
       </w:r>
-      <w:proofErr w:type="gramStart"/>
-      <w:r>
-        <w:rPr>
-          <w:rFonts w:ascii="Arial" w:eastAsia="Arial" w:hAnsi="Arial" w:cs="Arial"/>
-          <w:color w:val="000000"/>
-          <w:sz w:val="20"/>
-          <w:szCs w:val="20"/>
-        </w:rPr>
-        <w:t>This framework,</w:t>
-      </w:r>
-      <w:proofErr w:type="gramEnd"/>
-      <w:r>
-        <w:rPr>
-          <w:rFonts w:ascii="Arial" w:eastAsia="Arial" w:hAnsi="Arial" w:cs="Arial"/>
-          <w:color w:val="000000"/>
-          <w:sz w:val="20"/>
-          <w:szCs w:val="20"/>
-        </w:rPr>
-        <w:t xml:space="preserve"> built using Node, Angular 2, and TypeScript, </w:t>
+      <w:r>
+        <w:rPr>
+          <w:rFonts w:ascii="Arial" w:eastAsia="Arial" w:hAnsi="Arial" w:cs="Arial"/>
+          <w:color w:val="000000"/>
+          <w:sz w:val="20"/>
+          <w:szCs w:val="20"/>
+        </w:rPr>
+        <w:t xml:space="preserve">This framework, built using Node, Angular 2, and TypeScript, </w:t>
       </w:r>
       <w:r>
         <w:rPr>
@@ -4651,7 +4560,6 @@
               <w:bottom w:val="single" w:sz="8" w:space="0" w:color="FFFFFF"/>
               <w:right w:val="single" w:sz="8" w:space="0" w:color="FFFFFF"/>
             </w:tcBorders>
-            <w:shd w:val="clear" w:color="auto" w:fill="auto"/>
             <w:tcMar>
               <w:top w:w="80" w:type="dxa"/>
               <w:left w:w="80" w:type="dxa"/>
@@ -4803,7 +4711,6 @@
               <w:bottom w:val="single" w:sz="8" w:space="0" w:color="FFFFFF"/>
               <w:right w:val="single" w:sz="8" w:space="0" w:color="FFFFFF"/>
             </w:tcBorders>
-            <w:shd w:val="clear" w:color="auto" w:fill="auto"/>
             <w:tcMar>
               <w:top w:w="80" w:type="dxa"/>
               <w:left w:w="80" w:type="dxa"/>
@@ -4936,7 +4843,6 @@
               <w:bottom w:val="single" w:sz="8" w:space="0" w:color="FFFFFF"/>
               <w:right w:val="single" w:sz="8" w:space="0" w:color="FFFFFF"/>
             </w:tcBorders>
-            <w:shd w:val="clear" w:color="auto" w:fill="auto"/>
             <w:tcMar>
               <w:top w:w="80" w:type="dxa"/>
               <w:left w:w="80" w:type="dxa"/>
@@ -6368,7 +6274,6 @@
           <w:szCs w:val="20"/>
         </w:rPr>
       </w:pPr>
-      <w:proofErr w:type="spellStart"/>
       <w:r>
         <w:rPr>
           <w:rFonts w:ascii="Arial" w:eastAsia="Arial" w:hAnsi="Arial" w:cs="Arial"/>
@@ -6378,7 +6283,6 @@
         </w:rPr>
         <w:t>WireMock</w:t>
       </w:r>
-      <w:proofErr w:type="spellEnd"/>
     </w:p>
     <w:p>
       <w:pPr>
@@ -7332,7 +7236,6 @@
       </w:rPr>
       <w:tab/>
     </w:r>
-    <w:proofErr w:type="spellStart"/>
     <w:r>
       <w:rPr>
         <w:rFonts w:ascii="Arial Black" w:eastAsia="Arial Black" w:hAnsi="Arial Black" w:cs="Arial Black"/>
@@ -7349,17 +7252,7 @@
         <w:szCs w:val="20"/>
         <w:lang w:val="nl-NL"/>
       </w:rPr>
-      <w:t>ll</w:t>
-    </w:r>
-    <w:proofErr w:type="spellEnd"/>
-    <w:r>
-      <w:rPr>
-        <w:rFonts w:ascii="Arial Black" w:eastAsia="Arial Black" w:hAnsi="Arial Black" w:cs="Arial Black"/>
-        <w:sz w:val="20"/>
-        <w:szCs w:val="20"/>
-        <w:lang w:val="nl-NL"/>
-      </w:rPr>
-      <w:t xml:space="preserve">: </w:t>
+      <w:t xml:space="preserve">ll: </w:t>
     </w:r>
     <w:r>
       <w:rPr>
@@ -8595,28 +8488,28 @@
 </file>
 
 <file path=customXml/item1.xml><?xml version="1.0" encoding="utf-8"?>
-<b:Sources xmlns:b="http://schemas.openxmlformats.org/officeDocument/2006/bibliography" xmlns="http://schemas.openxmlformats.org/officeDocument/2006/bibliography" SelectedStyle="\APASixthEditionOfficeOnline.xsl" StyleName="APA" Version="6"/>
-</file>
-
-<file path=customXml/item2.xml><?xml version="1.0" encoding="utf-8"?>
 <go:gDocsCustomXmlDataStorage xmlns:go="http://customooxmlschemas.google.com/" xmlns:r="http://schemas.openxmlformats.org/officeDocument/2006/relationships">
   <go:docsCustomData xmlns:go="http://customooxmlschemas.google.com/" roundtripDataSignature="AMtx7miMhC1YLhKSRHFicWIjG58lmXEHYA==">AMUW2mWPZZNbIEmc4e3sdlXQYh7PNdm/iS9juSUUGtm8gs/NLixs86kQyt7Cpc2IF3jikSZ8/0IiAC7oORVYQ7cYEP7rvUwqZCVLFjzrvH2X0ACMZOanApHqoEpKaZbT5qkfxooSYNufO/pSZ3IRRrIeqYf8SCC69JFOBkc/4CndazVYv3ocOh3mWGBJSAX4r64ymNXgUm0bJThZV68mn19c0h9yOO+WTrPG4Vrb2iR4javuKKYxbF/wzPSFBngyP8MDCPQpEHFa15gMOU/SFao1ZfzzZYzRY/U4gvNQnAY7wyMnmI7o3PA=</go:docsCustomData>
 </go:gDocsCustomXmlDataStorage>
 </file>
 
-<file path=customXml/itemProps1.xml><?xml version="1.0" encoding="utf-8"?>
-<ds:datastoreItem xmlns:ds="http://schemas.openxmlformats.org/officeDocument/2006/customXml" ds:itemID="{A9EBA0DE-A728-4A86-9644-5131A74A113F}">
-  <ds:schemaRefs>
-    <ds:schemaRef ds:uri="http://schemas.openxmlformats.org/officeDocument/2006/bibliography"/>
-  </ds:schemaRefs>
-</ds:datastoreItem>
+<file path=customXml/item2.xml><?xml version="1.0" encoding="utf-8"?>
+<b:Sources xmlns:b="http://schemas.openxmlformats.org/officeDocument/2006/bibliography" xmlns="http://schemas.openxmlformats.org/officeDocument/2006/bibliography" SelectedStyle="\APASixthEditionOfficeOnline.xsl" StyleName="APA" Version="6"/>
 </file>
 
-<file path=customXml/itemProps2.xml><?xml version="1.0" encoding="utf-8"?>
+<file path=customXml/itemProps1.xml><?xml version="1.0" encoding="utf-8"?>
 <ds:datastoreItem xmlns:ds="http://schemas.openxmlformats.org/officeDocument/2006/customXml" ds:itemID="{11111111-1234-1234-1234-123412341234}">
   <ds:schemaRefs>
     <ds:schemaRef ds:uri="http://customooxmlschemas.google.com/"/>
     <ds:schemaRef ds:uri="http://schemas.openxmlformats.org/officeDocument/2006/relationships"/>
   </ds:schemaRefs>
 </ds:datastoreItem>
+</file>
+
+<file path=customXml/itemProps2.xml><?xml version="1.0" encoding="utf-8"?>
+<ds:datastoreItem xmlns:ds="http://schemas.openxmlformats.org/officeDocument/2006/customXml" ds:itemID="{A9EBA0DE-A728-4A86-9644-5131A74A113F}">
+  <ds:schemaRefs>
+    <ds:schemaRef ds:uri="http://schemas.openxmlformats.org/officeDocument/2006/bibliography"/>
+  </ds:schemaRefs>
+</ds:datastoreItem>
 </file>
</xml_diff>